<commit_message>
docs: ay 2 değerlendirmesi eklendi, hafta 4 raporu tamamlandi
</commit_message>
<xml_diff>
--- a/Hafta_4_Rapor.docx
+++ b/Hafta_4_Rapor.docx
@@ -562,48 +562,16 @@
           <w:b/>
           <w:bCs/>
         </w:rPr>
-        <w:t xml:space="preserve">Maximum Depth </w:t>
-      </w:r>
+        <w:t xml:space="preserve">Maximum Depth of </w:t>
+      </w:r>
+      <w:proofErr w:type="spellStart"/>
       <w:r>
         <w:rPr>
           <w:rStyle w:val="Kpr"/>
           <w:b/>
           <w:bCs/>
         </w:rPr>
-        <w:t>o</w:t>
-      </w:r>
-      <w:r>
-        <w:rPr>
-          <w:rStyle w:val="Kpr"/>
-          <w:b/>
-          <w:bCs/>
-        </w:rPr>
-        <w:t xml:space="preserve">f </w:t>
-      </w:r>
-      <w:proofErr w:type="spellStart"/>
-      <w:r>
-        <w:rPr>
-          <w:rStyle w:val="Kpr"/>
-          <w:b/>
-          <w:bCs/>
-        </w:rPr>
-        <w:t>B</w:t>
-      </w:r>
-      <w:r>
-        <w:rPr>
-          <w:rStyle w:val="Kpr"/>
-          <w:b/>
-          <w:bCs/>
-        </w:rPr>
-        <w:t>i</w:t>
-      </w:r>
-      <w:r>
-        <w:rPr>
-          <w:rStyle w:val="Kpr"/>
-          <w:b/>
-          <w:bCs/>
-        </w:rPr>
-        <w:t>nary</w:t>
+        <w:t>Binary</w:t>
       </w:r>
       <w:proofErr w:type="spellEnd"/>
       <w:r>
@@ -1201,14 +1169,7 @@
           <w:bCs/>
         </w:rPr>
         <w:lastRenderedPageBreak/>
-        <w:t>4.</w:t>
-      </w:r>
-      <w:r>
-        <w:rPr>
-          <w:b/>
-          <w:bCs/>
-        </w:rPr>
-        <w:t>Uyku Takip Tablosu</w:t>
+        <w:t>4.Uyku Takip Tablosu</w:t>
       </w:r>
     </w:p>
     <w:p/>
@@ -1444,7 +1405,7 @@
                 <w:sz w:val="22"/>
                 <w:szCs w:val="22"/>
               </w:rPr>
-              <w:t>01</w:t>
+              <w:t>23</w:t>
             </w:r>
             <w:r>
               <w:rPr>
@@ -1483,7 +1444,15 @@
                 <w:sz w:val="22"/>
                 <w:szCs w:val="22"/>
               </w:rPr>
-              <w:t>08.</w:t>
+              <w:t>7</w:t>
+            </w:r>
+            <w:r>
+              <w:rPr>
+                <w:color w:val="000000" w:themeColor="text1"/>
+                <w:sz w:val="22"/>
+                <w:szCs w:val="22"/>
+              </w:rPr>
+              <w:t>.</w:t>
             </w:r>
             <w:r>
               <w:rPr>
@@ -1514,7 +1483,15 @@
                 <w:sz w:val="22"/>
                 <w:szCs w:val="22"/>
               </w:rPr>
-              <w:t>07.</w:t>
+              <w:t>08</w:t>
+            </w:r>
+            <w:r>
+              <w:rPr>
+                <w:color w:val="000000" w:themeColor="text1"/>
+                <w:sz w:val="22"/>
+                <w:szCs w:val="22"/>
+              </w:rPr>
+              <w:t>.</w:t>
             </w:r>
             <w:r>
               <w:rPr>
@@ -1704,7 +1681,109 @@
                 <w:sz w:val="22"/>
                 <w:szCs w:val="22"/>
               </w:rPr>
-              <w:t>24</w:t>
+              <w:t>23</w:t>
+            </w:r>
+            <w:r>
+              <w:rPr>
+                <w:color w:val="000000" w:themeColor="text1"/>
+                <w:sz w:val="22"/>
+                <w:szCs w:val="22"/>
+              </w:rPr>
+              <w:t>.</w:t>
+            </w:r>
+            <w:r>
+              <w:rPr>
+                <w:color w:val="000000" w:themeColor="text1"/>
+                <w:sz w:val="22"/>
+                <w:szCs w:val="22"/>
+              </w:rPr>
+              <w:t>3</w:t>
+            </w:r>
+            <w:r>
+              <w:rPr>
+                <w:color w:val="000000" w:themeColor="text1"/>
+                <w:sz w:val="22"/>
+                <w:szCs w:val="22"/>
+              </w:rPr>
+              <w:t>0</w:t>
+            </w:r>
+          </w:p>
+        </w:tc>
+        <w:tc>
+          <w:tcPr>
+            <w:tcW w:w="2024" w:type="dxa"/>
+            <w:vAlign w:val="center"/>
+          </w:tcPr>
+          <w:p>
+            <w:pPr>
+              <w:rPr>
+                <w:color w:val="000000" w:themeColor="text1"/>
+                <w:sz w:val="22"/>
+                <w:szCs w:val="22"/>
+              </w:rPr>
+            </w:pPr>
+            <w:r>
+              <w:rPr>
+                <w:color w:val="000000" w:themeColor="text1"/>
+                <w:sz w:val="22"/>
+                <w:szCs w:val="22"/>
+              </w:rPr>
+              <w:t>0</w:t>
+            </w:r>
+            <w:r>
+              <w:rPr>
+                <w:color w:val="000000" w:themeColor="text1"/>
+                <w:sz w:val="22"/>
+                <w:szCs w:val="22"/>
+              </w:rPr>
+              <w:t>7</w:t>
+            </w:r>
+            <w:r>
+              <w:rPr>
+                <w:color w:val="000000" w:themeColor="text1"/>
+                <w:sz w:val="22"/>
+                <w:szCs w:val="22"/>
+              </w:rPr>
+              <w:t>.</w:t>
+            </w:r>
+            <w:r>
+              <w:rPr>
+                <w:color w:val="000000" w:themeColor="text1"/>
+                <w:sz w:val="22"/>
+                <w:szCs w:val="22"/>
+              </w:rPr>
+              <w:t>3</w:t>
+            </w:r>
+            <w:r>
+              <w:rPr>
+                <w:color w:val="000000" w:themeColor="text1"/>
+                <w:sz w:val="22"/>
+                <w:szCs w:val="22"/>
+              </w:rPr>
+              <w:t>0</w:t>
+            </w:r>
+          </w:p>
+        </w:tc>
+        <w:tc>
+          <w:tcPr>
+            <w:tcW w:w="2025" w:type="dxa"/>
+            <w:vAlign w:val="center"/>
+          </w:tcPr>
+          <w:p>
+            <w:pPr>
+              <w:rPr>
+                <w:color w:val="000000" w:themeColor="text1"/>
+                <w:sz w:val="22"/>
+                <w:szCs w:val="22"/>
+              </w:rPr>
+            </w:pPr>
+            <w:r>
+              <w:rPr>
+                <w:color w:val="000000" w:themeColor="text1"/>
+                <w:sz w:val="22"/>
+                <w:szCs w:val="22"/>
+              </w:rPr>
+              <w:t>8</w:t>
             </w:r>
             <w:r>
               <w:rPr>
@@ -1713,100 +1792,6 @@
                 <w:szCs w:val="22"/>
               </w:rPr>
               <w:t>.00</w:t>
-            </w:r>
-          </w:p>
-        </w:tc>
-        <w:tc>
-          <w:tcPr>
-            <w:tcW w:w="2024" w:type="dxa"/>
-            <w:vAlign w:val="center"/>
-          </w:tcPr>
-          <w:p>
-            <w:pPr>
-              <w:rPr>
-                <w:color w:val="000000" w:themeColor="text1"/>
-                <w:sz w:val="22"/>
-                <w:szCs w:val="22"/>
-              </w:rPr>
-            </w:pPr>
-            <w:r>
-              <w:rPr>
-                <w:color w:val="000000" w:themeColor="text1"/>
-                <w:sz w:val="22"/>
-                <w:szCs w:val="22"/>
-              </w:rPr>
-              <w:t>08</w:t>
-            </w:r>
-            <w:r>
-              <w:rPr>
-                <w:color w:val="000000" w:themeColor="text1"/>
-                <w:sz w:val="22"/>
-                <w:szCs w:val="22"/>
-              </w:rPr>
-              <w:t>.</w:t>
-            </w:r>
-            <w:r>
-              <w:rPr>
-                <w:color w:val="000000" w:themeColor="text1"/>
-                <w:sz w:val="22"/>
-                <w:szCs w:val="22"/>
-              </w:rPr>
-              <w:t>4</w:t>
-            </w:r>
-            <w:r>
-              <w:rPr>
-                <w:color w:val="000000" w:themeColor="text1"/>
-                <w:sz w:val="22"/>
-                <w:szCs w:val="22"/>
-              </w:rPr>
-              <w:t>0</w:t>
-            </w:r>
-          </w:p>
-        </w:tc>
-        <w:tc>
-          <w:tcPr>
-            <w:tcW w:w="2025" w:type="dxa"/>
-            <w:vAlign w:val="center"/>
-          </w:tcPr>
-          <w:p>
-            <w:pPr>
-              <w:rPr>
-                <w:color w:val="000000" w:themeColor="text1"/>
-                <w:sz w:val="22"/>
-                <w:szCs w:val="22"/>
-              </w:rPr>
-            </w:pPr>
-            <w:r>
-              <w:rPr>
-                <w:color w:val="000000" w:themeColor="text1"/>
-                <w:sz w:val="22"/>
-                <w:szCs w:val="22"/>
-              </w:rPr>
-              <w:t>8</w:t>
-            </w:r>
-            <w:r>
-              <w:rPr>
-                <w:color w:val="000000" w:themeColor="text1"/>
-                <w:sz w:val="22"/>
-                <w:szCs w:val="22"/>
-              </w:rPr>
-              <w:t>.</w:t>
-            </w:r>
-            <w:r>
-              <w:rPr>
-                <w:color w:val="000000" w:themeColor="text1"/>
-                <w:sz w:val="22"/>
-                <w:szCs w:val="22"/>
-              </w:rPr>
-              <w:t>4</w:t>
-            </w:r>
-            <w:r>
-              <w:rPr>
-                <w:color w:val="000000" w:themeColor="text1"/>
-                <w:sz w:val="22"/>
-                <w:szCs w:val="22"/>
-              </w:rPr>
-              <w:t>0</w:t>
             </w:r>
           </w:p>
         </w:tc>
@@ -1850,15 +1835,31 @@
                 <w:sz w:val="22"/>
                 <w:szCs w:val="22"/>
               </w:rPr>
-              <w:t>00</w:t>
-            </w:r>
-            <w:r>
-              <w:rPr>
-                <w:color w:val="000000" w:themeColor="text1"/>
-                <w:sz w:val="22"/>
-                <w:szCs w:val="22"/>
-              </w:rPr>
-              <w:t>.30</w:t>
+              <w:t>23</w:t>
+            </w:r>
+            <w:r>
+              <w:rPr>
+                <w:color w:val="000000" w:themeColor="text1"/>
+                <w:sz w:val="22"/>
+                <w:szCs w:val="22"/>
+              </w:rPr>
+              <w:t>.</w:t>
+            </w:r>
+            <w:r>
+              <w:rPr>
+                <w:color w:val="000000" w:themeColor="text1"/>
+                <w:sz w:val="22"/>
+                <w:szCs w:val="22"/>
+              </w:rPr>
+              <w:t>3</w:t>
+            </w:r>
+            <w:r>
+              <w:rPr>
+                <w:color w:val="000000" w:themeColor="text1"/>
+                <w:sz w:val="22"/>
+                <w:szCs w:val="22"/>
+              </w:rPr>
+              <w:t>0</w:t>
             </w:r>
           </w:p>
         </w:tc>
@@ -1881,7 +1882,7 @@
                 <w:sz w:val="22"/>
                 <w:szCs w:val="22"/>
               </w:rPr>
-              <w:t>10</w:t>
+              <w:t>8</w:t>
             </w:r>
             <w:r>
               <w:rPr>
@@ -1920,7 +1921,7 @@
                 <w:sz w:val="22"/>
                 <w:szCs w:val="22"/>
               </w:rPr>
-              <w:t>10</w:t>
+              <w:t>9</w:t>
             </w:r>
             <w:r>
               <w:rPr>
@@ -1936,7 +1937,15 @@
                 <w:sz w:val="22"/>
                 <w:szCs w:val="22"/>
               </w:rPr>
-              <w:t>00</w:t>
+              <w:t>0</w:t>
+            </w:r>
+            <w:r>
+              <w:rPr>
+                <w:color w:val="000000" w:themeColor="text1"/>
+                <w:sz w:val="22"/>
+                <w:szCs w:val="22"/>
+              </w:rPr>
+              <w:t>0</w:t>
             </w:r>
           </w:p>
         </w:tc>
@@ -2011,7 +2020,7 @@
                 <w:sz w:val="22"/>
                 <w:szCs w:val="22"/>
               </w:rPr>
-              <w:t>9</w:t>
+              <w:t>8</w:t>
             </w:r>
             <w:r>
               <w:rPr>
@@ -2050,7 +2059,7 @@
                 <w:sz w:val="22"/>
                 <w:szCs w:val="22"/>
               </w:rPr>
-              <w:t>9</w:t>
+              <w:t>8</w:t>
             </w:r>
             <w:r>
               <w:rPr>
@@ -2196,7 +2205,10 @@
     </w:tbl>
     <w:p>
       <w:r>
-        <w:t>Haftalık Ortalama: 8 saat 49 dakika</w:t>
+        <w:t xml:space="preserve">Haftalık Ortalama: </w:t>
+      </w:r>
+      <w:r>
+        <w:t>8 saat 34 dakika</w:t>
       </w:r>
     </w:p>
     <w:p/>
@@ -2305,52 +2317,890 @@
           <w:b/>
           <w:bCs/>
         </w:rPr>
-        <w:t xml:space="preserve">6. </w:t>
-      </w:r>
-      <w:r>
+        <w:t>6. Haftalık Genel Değerlendirme</w:t>
+      </w:r>
+    </w:p>
+    <w:p>
+      <w:r>
+        <w:t xml:space="preserve">Bu hafta, öğrendiğim tüm konuları (fonksiyonlar, hata yönetimi, dosya işlemleri, veri yapıları) bir araya getirip gerçek bir proje ortaya çıkardım, bu yüzden Ay 1'in en tatmin edici haftası oldu. </w:t>
+      </w:r>
+      <w:proofErr w:type="spellStart"/>
+      <w:r>
+        <w:t>Stack</w:t>
+      </w:r>
+      <w:proofErr w:type="spellEnd"/>
+      <w:r>
+        <w:t xml:space="preserve"> ve Queue gibi temel veri yapılarını hem teoride hem kendi yazdığım kodla pratik ederek öğrendim. Görev takip uygulamasında karşılaştığım hatalar, </w:t>
+      </w:r>
+      <w:proofErr w:type="spellStart"/>
+      <w:r>
+        <w:t>debugging</w:t>
+      </w:r>
+      <w:proofErr w:type="spellEnd"/>
+      <w:r>
+        <w:t xml:space="preserve"> becerimin gerçek bir projede işe yaradığını gösterdi. Genel olarak bu ay boyunca kurulumdan başlayıp gerçek bir uygulama yazmaya kadar sağlam bir ilerleme kaydettiğimi düşünüyorum.</w:t>
+      </w:r>
+    </w:p>
+    <w:p>
+      <w:r>
+        <w:t xml:space="preserve">Tarih: </w:t>
+      </w:r>
+      <w:proofErr w:type="gramStart"/>
+      <w:r>
+        <w:t>04.08.2026 -</w:t>
+      </w:r>
+      <w:proofErr w:type="gramEnd"/>
+      <w:r>
+        <w:t xml:space="preserve"> 09.08.2026</w:t>
+      </w:r>
+    </w:p>
+    <w:p/>
+    <w:p/>
+    <w:p/>
+    <w:p/>
+    <w:p>
+      <w:pPr>
+        <w:jc w:val="center"/>
         <w:rPr>
           <w:b/>
           <w:bCs/>
+          <w:sz w:val="32"/>
+          <w:szCs w:val="32"/>
         </w:rPr>
-        <w:t>Haftalık Genel Değerlendirme</w:t>
+      </w:pPr>
+      <w:r>
+        <w:rPr>
+          <w:b/>
+          <w:bCs/>
+          <w:sz w:val="32"/>
+          <w:szCs w:val="32"/>
+        </w:rPr>
+        <w:lastRenderedPageBreak/>
+        <w:t>Ay Sonu Değerlendirmesi</w:t>
+      </w:r>
+      <w:r>
+        <w:rPr>
+          <w:b/>
+          <w:bCs/>
+          <w:sz w:val="32"/>
+          <w:szCs w:val="32"/>
+        </w:rPr>
+        <w:br/>
+      </w:r>
+    </w:p>
+    <w:tbl>
+      <w:tblPr>
+        <w:tblW w:w="0" w:type="auto"/>
+        <w:tblCellSpacing w:w="15" w:type="dxa"/>
+        <w:tblBorders>
+          <w:top w:val="single" w:sz="4" w:space="0" w:color="auto"/>
+          <w:left w:val="single" w:sz="4" w:space="0" w:color="auto"/>
+          <w:bottom w:val="single" w:sz="4" w:space="0" w:color="auto"/>
+          <w:right w:val="single" w:sz="4" w:space="0" w:color="auto"/>
+          <w:insideH w:val="single" w:sz="4" w:space="0" w:color="auto"/>
+          <w:insideV w:val="single" w:sz="4" w:space="0" w:color="auto"/>
+        </w:tblBorders>
+        <w:tblCellMar>
+          <w:top w:w="15" w:type="dxa"/>
+          <w:left w:w="15" w:type="dxa"/>
+          <w:bottom w:w="15" w:type="dxa"/>
+          <w:right w:w="15" w:type="dxa"/>
+        </w:tblCellMar>
+        <w:tblLook w:val="04A0" w:firstRow="1" w:lastRow="0" w:firstColumn="1" w:lastColumn="0" w:noHBand="0" w:noVBand="1"/>
+      </w:tblPr>
+      <w:tblGrid>
+        <w:gridCol w:w="1732"/>
+        <w:gridCol w:w="2300"/>
+        <w:gridCol w:w="3193"/>
+        <w:gridCol w:w="1315"/>
+      </w:tblGrid>
+      <w:tr>
+        <w:trPr>
+          <w:tblHeader/>
+          <w:tblCellSpacing w:w="15" w:type="dxa"/>
+        </w:trPr>
+        <w:tc>
+          <w:tcPr>
+            <w:tcW w:w="0" w:type="auto"/>
+            <w:vAlign w:val="center"/>
+            <w:hideMark/>
+          </w:tcPr>
+          <w:p>
+            <w:pPr>
+              <w:rPr>
+                <w:b/>
+                <w:bCs/>
+              </w:rPr>
+            </w:pPr>
+            <w:r>
+              <w:rPr>
+                <w:b/>
+                <w:bCs/>
+              </w:rPr>
+              <w:t>Kategori</w:t>
+            </w:r>
+          </w:p>
+        </w:tc>
+        <w:tc>
+          <w:tcPr>
+            <w:tcW w:w="0" w:type="auto"/>
+            <w:vAlign w:val="center"/>
+            <w:hideMark/>
+          </w:tcPr>
+          <w:p>
+            <w:pPr>
+              <w:rPr>
+                <w:b/>
+                <w:bCs/>
+              </w:rPr>
+            </w:pPr>
+            <w:r>
+              <w:rPr>
+                <w:b/>
+                <w:bCs/>
+              </w:rPr>
+              <w:t>Kriter</w:t>
+            </w:r>
+          </w:p>
+        </w:tc>
+        <w:tc>
+          <w:tcPr>
+            <w:tcW w:w="3163" w:type="dxa"/>
+            <w:vAlign w:val="center"/>
+            <w:hideMark/>
+          </w:tcPr>
+          <w:p>
+            <w:pPr>
+              <w:rPr>
+                <w:b/>
+                <w:bCs/>
+              </w:rPr>
+            </w:pPr>
+            <w:r>
+              <w:rPr>
+                <w:b/>
+                <w:bCs/>
+              </w:rPr>
+              <w:t xml:space="preserve">Benim </w:t>
+            </w:r>
+            <w:r>
+              <w:rPr>
+                <w:b/>
+                <w:bCs/>
+              </w:rPr>
+              <w:t>Durumu</w:t>
+            </w:r>
+            <w:r>
+              <w:rPr>
+                <w:b/>
+                <w:bCs/>
+              </w:rPr>
+              <w:t>m</w:t>
+            </w:r>
+          </w:p>
+        </w:tc>
+        <w:tc>
+          <w:tcPr>
+            <w:tcW w:w="1270" w:type="dxa"/>
+            <w:vAlign w:val="center"/>
+            <w:hideMark/>
+          </w:tcPr>
+          <w:p>
+            <w:pPr>
+              <w:rPr>
+                <w:b/>
+                <w:bCs/>
+              </w:rPr>
+            </w:pPr>
+            <w:r>
+              <w:rPr>
+                <w:b/>
+                <w:bCs/>
+              </w:rPr>
+              <w:t>Hedef (Geç)</w:t>
+            </w:r>
+          </w:p>
+        </w:tc>
+      </w:tr>
+      <w:tr>
+        <w:trPr>
+          <w:tblCellSpacing w:w="15" w:type="dxa"/>
+        </w:trPr>
+        <w:tc>
+          <w:tcPr>
+            <w:tcW w:w="0" w:type="auto"/>
+            <w:vAlign w:val="center"/>
+            <w:hideMark/>
+          </w:tcPr>
+          <w:p>
+            <w:proofErr w:type="spellStart"/>
+            <w:r>
+              <w:t>GitHub</w:t>
+            </w:r>
+            <w:proofErr w:type="spellEnd"/>
+          </w:p>
+        </w:tc>
+        <w:tc>
+          <w:tcPr>
+            <w:tcW w:w="0" w:type="auto"/>
+            <w:vAlign w:val="center"/>
+            <w:hideMark/>
+          </w:tcPr>
+          <w:p>
+            <w:r>
+              <w:t xml:space="preserve">En az 15 </w:t>
+            </w:r>
+            <w:proofErr w:type="spellStart"/>
+            <w:r>
+              <w:t>commit</w:t>
+            </w:r>
+            <w:proofErr w:type="spellEnd"/>
+          </w:p>
+        </w:tc>
+        <w:tc>
+          <w:tcPr>
+            <w:tcW w:w="3163" w:type="dxa"/>
+            <w:vAlign w:val="center"/>
+            <w:hideMark/>
+          </w:tcPr>
+          <w:p>
+            <w:r>
+              <w:t>20</w:t>
+            </w:r>
+          </w:p>
+        </w:tc>
+        <w:tc>
+          <w:tcPr>
+            <w:tcW w:w="1270" w:type="dxa"/>
+            <w:vAlign w:val="center"/>
+            <w:hideMark/>
+          </w:tcPr>
+          <w:p>
+            <w:r>
+              <w:t>15+</w:t>
+            </w:r>
+          </w:p>
+        </w:tc>
+      </w:tr>
+      <w:tr>
+        <w:trPr>
+          <w:tblCellSpacing w:w="15" w:type="dxa"/>
+        </w:trPr>
+        <w:tc>
+          <w:tcPr>
+            <w:tcW w:w="0" w:type="auto"/>
+            <w:vAlign w:val="center"/>
+            <w:hideMark/>
+          </w:tcPr>
+          <w:p>
+            <w:proofErr w:type="spellStart"/>
+            <w:r>
+              <w:t>LeetCode</w:t>
+            </w:r>
+            <w:proofErr w:type="spellEnd"/>
+          </w:p>
+        </w:tc>
+        <w:tc>
+          <w:tcPr>
+            <w:tcW w:w="0" w:type="auto"/>
+            <w:vAlign w:val="center"/>
+            <w:hideMark/>
+          </w:tcPr>
+          <w:p>
+            <w:r>
+              <w:t xml:space="preserve">En az 8 </w:t>
+            </w:r>
+            <w:proofErr w:type="spellStart"/>
+            <w:r>
+              <w:t>Easy</w:t>
+            </w:r>
+            <w:proofErr w:type="spellEnd"/>
+            <w:r>
+              <w:t xml:space="preserve"> problem</w:t>
+            </w:r>
+          </w:p>
+        </w:tc>
+        <w:tc>
+          <w:tcPr>
+            <w:tcW w:w="3163" w:type="dxa"/>
+            <w:vAlign w:val="center"/>
+            <w:hideMark/>
+          </w:tcPr>
+          <w:p>
+            <w:r>
+              <w:t xml:space="preserve">8 </w:t>
+            </w:r>
+          </w:p>
+        </w:tc>
+        <w:tc>
+          <w:tcPr>
+            <w:tcW w:w="1270" w:type="dxa"/>
+            <w:vAlign w:val="center"/>
+            <w:hideMark/>
+          </w:tcPr>
+          <w:p>
+            <w:r>
+              <w:t>8+</w:t>
+            </w:r>
+          </w:p>
+        </w:tc>
+      </w:tr>
+      <w:tr>
+        <w:trPr>
+          <w:tblCellSpacing w:w="15" w:type="dxa"/>
+        </w:trPr>
+        <w:tc>
+          <w:tcPr>
+            <w:tcW w:w="0" w:type="auto"/>
+            <w:vAlign w:val="center"/>
+            <w:hideMark/>
+          </w:tcPr>
+          <w:p>
+            <w:r>
+              <w:t>Haftalık Rapor</w:t>
+            </w:r>
+          </w:p>
+        </w:tc>
+        <w:tc>
+          <w:tcPr>
+            <w:tcW w:w="0" w:type="auto"/>
+            <w:vAlign w:val="center"/>
+            <w:hideMark/>
+          </w:tcPr>
+          <w:p>
+            <w:r>
+              <w:t>4 rapor eksiksiz</w:t>
+            </w:r>
+          </w:p>
+        </w:tc>
+        <w:tc>
+          <w:tcPr>
+            <w:tcW w:w="3163" w:type="dxa"/>
+            <w:vAlign w:val="center"/>
+            <w:hideMark/>
+          </w:tcPr>
+          <w:p>
+            <w:r>
+              <w:t xml:space="preserve">4/4 </w:t>
+            </w:r>
+          </w:p>
+        </w:tc>
+        <w:tc>
+          <w:tcPr>
+            <w:tcW w:w="1270" w:type="dxa"/>
+            <w:vAlign w:val="center"/>
+            <w:hideMark/>
+          </w:tcPr>
+          <w:p>
+            <w:r>
+              <w:t>4/4</w:t>
+            </w:r>
+          </w:p>
+        </w:tc>
+      </w:tr>
+      <w:tr>
+        <w:trPr>
+          <w:tblCellSpacing w:w="15" w:type="dxa"/>
+        </w:trPr>
+        <w:tc>
+          <w:tcPr>
+            <w:tcW w:w="0" w:type="auto"/>
+            <w:vAlign w:val="center"/>
+            <w:hideMark/>
+          </w:tcPr>
+          <w:p>
+            <w:r>
+              <w:t>Teknik Kaynak</w:t>
+            </w:r>
+          </w:p>
+        </w:tc>
+        <w:tc>
+          <w:tcPr>
+            <w:tcW w:w="0" w:type="auto"/>
+            <w:vAlign w:val="center"/>
+            <w:hideMark/>
+          </w:tcPr>
+          <w:p>
+            <w:r>
+              <w:t>4 makale özeti</w:t>
+            </w:r>
+          </w:p>
+        </w:tc>
+        <w:tc>
+          <w:tcPr>
+            <w:tcW w:w="3163" w:type="dxa"/>
+            <w:vAlign w:val="center"/>
+            <w:hideMark/>
+          </w:tcPr>
+          <w:p>
+            <w:r>
+              <w:t xml:space="preserve">4 </w:t>
+            </w:r>
+          </w:p>
+        </w:tc>
+        <w:tc>
+          <w:tcPr>
+            <w:tcW w:w="1270" w:type="dxa"/>
+            <w:vAlign w:val="center"/>
+            <w:hideMark/>
+          </w:tcPr>
+          <w:p>
+            <w:r>
+              <w:t>4</w:t>
+            </w:r>
+          </w:p>
+        </w:tc>
+      </w:tr>
+      <w:tr>
+        <w:trPr>
+          <w:tblCellSpacing w:w="15" w:type="dxa"/>
+        </w:trPr>
+        <w:tc>
+          <w:tcPr>
+            <w:tcW w:w="0" w:type="auto"/>
+            <w:vAlign w:val="center"/>
+            <w:hideMark/>
+          </w:tcPr>
+          <w:p>
+            <w:r>
+              <w:t>Ortam Kurulumu</w:t>
+            </w:r>
+          </w:p>
+        </w:tc>
+        <w:tc>
+          <w:tcPr>
+            <w:tcW w:w="0" w:type="auto"/>
+            <w:vAlign w:val="center"/>
+            <w:hideMark/>
+          </w:tcPr>
+          <w:p>
+            <w:r>
+              <w:t>Tüm araçlar çalışıyor</w:t>
+            </w:r>
+          </w:p>
+        </w:tc>
+        <w:tc>
+          <w:tcPr>
+            <w:tcW w:w="3163" w:type="dxa"/>
+            <w:vAlign w:val="center"/>
+            <w:hideMark/>
+          </w:tcPr>
+          <w:p>
+            <w:r>
+              <w:t xml:space="preserve">Tam </w:t>
+            </w:r>
+          </w:p>
+        </w:tc>
+        <w:tc>
+          <w:tcPr>
+            <w:tcW w:w="1270" w:type="dxa"/>
+            <w:vAlign w:val="center"/>
+            <w:hideMark/>
+          </w:tcPr>
+          <w:p>
+            <w:r>
+              <w:t>Tam</w:t>
+            </w:r>
+          </w:p>
+        </w:tc>
+      </w:tr>
+      <w:tr>
+        <w:trPr>
+          <w:tblCellSpacing w:w="15" w:type="dxa"/>
+        </w:trPr>
+        <w:tc>
+          <w:tcPr>
+            <w:tcW w:w="0" w:type="auto"/>
+            <w:vAlign w:val="center"/>
+            <w:hideMark/>
+          </w:tcPr>
+          <w:p>
+            <w:r>
+              <w:t>Mini Proje</w:t>
+            </w:r>
+          </w:p>
+        </w:tc>
+        <w:tc>
+          <w:tcPr>
+            <w:tcW w:w="0" w:type="auto"/>
+            <w:vAlign w:val="center"/>
+            <w:hideMark/>
+          </w:tcPr>
+          <w:p>
+            <w:r>
+              <w:t>Çalışır kod + README</w:t>
+            </w:r>
+          </w:p>
+        </w:tc>
+        <w:tc>
+          <w:tcPr>
+            <w:tcW w:w="3163" w:type="dxa"/>
+            <w:vAlign w:val="center"/>
+            <w:hideMark/>
+          </w:tcPr>
+          <w:p>
+            <w:r>
+              <w:t xml:space="preserve">Var </w:t>
+            </w:r>
+          </w:p>
+        </w:tc>
+        <w:tc>
+          <w:tcPr>
+            <w:tcW w:w="1270" w:type="dxa"/>
+            <w:vAlign w:val="center"/>
+            <w:hideMark/>
+          </w:tcPr>
+          <w:p>
+            <w:r>
+              <w:t>Var</w:t>
+            </w:r>
+          </w:p>
+        </w:tc>
+      </w:tr>
+      <w:tr>
+        <w:trPr>
+          <w:tblCellSpacing w:w="15" w:type="dxa"/>
+        </w:trPr>
+        <w:tc>
+          <w:tcPr>
+            <w:tcW w:w="0" w:type="auto"/>
+            <w:vAlign w:val="center"/>
+            <w:hideMark/>
+          </w:tcPr>
+          <w:p>
+            <w:r>
+              <w:t>Uyku Düzeni</w:t>
+            </w:r>
+          </w:p>
+        </w:tc>
+        <w:tc>
+          <w:tcPr>
+            <w:tcW w:w="0" w:type="auto"/>
+            <w:vAlign w:val="center"/>
+            <w:hideMark/>
+          </w:tcPr>
+          <w:p>
+            <w:r>
+              <w:t>4+ gün, ±45dk tolerans</w:t>
+            </w:r>
+          </w:p>
+        </w:tc>
+        <w:tc>
+          <w:tcPr>
+            <w:tcW w:w="3163" w:type="dxa"/>
+            <w:vAlign w:val="center"/>
+            <w:hideMark/>
+          </w:tcPr>
+          <w:p>
+            <w:r>
+              <w:t>4 haftanın 3'ünde karşılandı</w:t>
+            </w:r>
+          </w:p>
+        </w:tc>
+        <w:tc>
+          <w:tcPr>
+            <w:tcW w:w="1270" w:type="dxa"/>
+            <w:vAlign w:val="center"/>
+            <w:hideMark/>
+          </w:tcPr>
+          <w:p>
+            <w:r>
+              <w:t>4+ gün/hafta</w:t>
+            </w:r>
+          </w:p>
+        </w:tc>
+      </w:tr>
+    </w:tbl>
+    <w:p/>
+    <w:p>
+      <w:r>
+        <w:t>AY SONU ÖZ DEĞERLENDİRME</w:t>
       </w:r>
     </w:p>
     <w:p>
       <w:r>
-        <w:t xml:space="preserve">Bu hafta, öğrendiğim tüm konuları (fonksiyonlar, hata yönetimi, dosya işlemleri, veri yapıları) bir araya getirip gerçek bir proje ortaya çıkardım, bu yüzden Ay 1'in en tatmin edici haftası oldu. </w:t>
-      </w:r>
-      <w:proofErr w:type="spellStart"/>
-      <w:r>
-        <w:t>Stack</w:t>
-      </w:r>
-      <w:proofErr w:type="spellEnd"/>
-      <w:r>
-        <w:t xml:space="preserve"> ve Queue gibi temel veri yapılarını hem teoride hem kendi yazdığım kodla pratik ederek öğrendim. Görev takip uygulamasında karşılaştığım hatalar, </w:t>
-      </w:r>
-      <w:proofErr w:type="spellStart"/>
-      <w:r>
-        <w:t>debugging</w:t>
-      </w:r>
-      <w:proofErr w:type="spellEnd"/>
-      <w:r>
-        <w:t xml:space="preserve"> becerimin gerçek bir projede işe yaradığını gösterdi. Genel olarak bu ay boyunca kurulumdan başlayıp gerçek bir uygulama yazmaya kadar sağlam bir ilerleme kaydettiğimi düşünüyorum.</w:t>
+        <w:t>Bu Ay Ne Öğrendim</w:t>
       </w:r>
     </w:p>
     <w:p>
       <w:r>
-        <w:t xml:space="preserve">Tarih: </w:t>
-      </w:r>
+        <w:t xml:space="preserve">    </w:t>
+      </w:r>
+      <w:r>
+        <w:t>Bu ay sıfırdan başlayarak WSL</w:t>
+      </w:r>
+      <w:r>
+        <w:t xml:space="preserve"> </w:t>
+      </w:r>
+      <w:r>
+        <w:t xml:space="preserve">Linux ortamı kurmayı, Git ve </w:t>
+      </w:r>
+      <w:proofErr w:type="spellStart"/>
+      <w:r>
+        <w:t>GitHub</w:t>
+      </w:r>
+      <w:proofErr w:type="spellEnd"/>
+      <w:r>
+        <w:t xml:space="preserve"> (</w:t>
+      </w:r>
+      <w:proofErr w:type="spellStart"/>
+      <w:r>
+        <w:t>branch</w:t>
+      </w:r>
+      <w:proofErr w:type="spellEnd"/>
+      <w:r>
+        <w:t xml:space="preserve">, </w:t>
+      </w:r>
+      <w:proofErr w:type="spellStart"/>
+      <w:r>
+        <w:t>merge</w:t>
+      </w:r>
+      <w:proofErr w:type="spellEnd"/>
+      <w:r>
+        <w:t xml:space="preserve">, </w:t>
+      </w:r>
+      <w:proofErr w:type="spellStart"/>
+      <w:r>
+        <w:t>pull</w:t>
+      </w:r>
+      <w:proofErr w:type="spellEnd"/>
+      <w:r>
+        <w:t xml:space="preserve"> </w:t>
+      </w:r>
+      <w:proofErr w:type="spellStart"/>
+      <w:r>
+        <w:t>request</w:t>
+      </w:r>
+      <w:proofErr w:type="spellEnd"/>
+      <w:r>
+        <w:t xml:space="preserve">, </w:t>
+      </w:r>
+      <w:proofErr w:type="spellStart"/>
+      <w:r>
+        <w:t>code</w:t>
+      </w:r>
+      <w:proofErr w:type="spellEnd"/>
+      <w:r>
+        <w:t xml:space="preserve"> </w:t>
+      </w:r>
+      <w:proofErr w:type="spellStart"/>
+      <w:r>
+        <w:t>review</w:t>
+      </w:r>
+      <w:proofErr w:type="spellEnd"/>
+      <w:r>
+        <w:t xml:space="preserve">) kullanmayı, </w:t>
+      </w:r>
+      <w:proofErr w:type="spellStart"/>
+      <w:r>
+        <w:t>Python'ın</w:t>
+      </w:r>
+      <w:proofErr w:type="spellEnd"/>
+      <w:r>
+        <w:t xml:space="preserve"> temel yapı taşlarını (döngüler, fonksiyonlar, </w:t>
+      </w:r>
+      <w:proofErr w:type="spellStart"/>
       <w:proofErr w:type="gramStart"/>
       <w:r>
-        <w:t>04.08.2026 -</w:t>
+        <w:t>dictionary</w:t>
+      </w:r>
+      <w:proofErr w:type="spellEnd"/>
+      <w:r>
+        <w:t xml:space="preserve"> </w:t>
+      </w:r>
+      <w:r>
+        <w:t>,</w:t>
       </w:r>
       <w:proofErr w:type="gramEnd"/>
       <w:r>
-        <w:t xml:space="preserve"> 09.08.2026</w:t>
+        <w:t xml:space="preserve"> dosya işlemleri, hata yönetimi) ve temel veri yapılarını (</w:t>
+      </w:r>
+      <w:proofErr w:type="spellStart"/>
+      <w:r>
+        <w:t>stack</w:t>
+      </w:r>
+      <w:proofErr w:type="spellEnd"/>
+      <w:r>
+        <w:t xml:space="preserve">, </w:t>
+      </w:r>
+      <w:proofErr w:type="spellStart"/>
+      <w:r>
+        <w:t>queue</w:t>
+      </w:r>
+      <w:proofErr w:type="spellEnd"/>
+      <w:r>
+        <w:t xml:space="preserve">) öğrendim. Ayrıca VS </w:t>
+      </w:r>
+      <w:proofErr w:type="spellStart"/>
+      <w:r>
+        <w:t>Code</w:t>
+      </w:r>
+      <w:proofErr w:type="spellEnd"/>
+      <w:r>
+        <w:t xml:space="preserve"> </w:t>
+      </w:r>
+      <w:proofErr w:type="spellStart"/>
+      <w:r>
+        <w:t>debugger</w:t>
+      </w:r>
+      <w:proofErr w:type="spellEnd"/>
+      <w:r>
+        <w:t xml:space="preserve"> kullanmayı, terminal </w:t>
+      </w:r>
+      <w:proofErr w:type="gramStart"/>
+      <w:r>
+        <w:t>komutlarını,</w:t>
+      </w:r>
+      <w:proofErr w:type="gramEnd"/>
+      <w:r>
+        <w:t xml:space="preserve"> ve gerçek bir projeyi (görev takip uygulaması) sıfırdan yazıp </w:t>
+      </w:r>
+      <w:proofErr w:type="spellStart"/>
+      <w:r>
+        <w:t>GitHub'a</w:t>
+      </w:r>
+      <w:proofErr w:type="spellEnd"/>
+      <w:r>
+        <w:t xml:space="preserve"> </w:t>
+      </w:r>
+      <w:proofErr w:type="spellStart"/>
+      <w:r>
+        <w:t>push</w:t>
+      </w:r>
+      <w:proofErr w:type="spellEnd"/>
+      <w:r>
+        <w:t xml:space="preserve"> </w:t>
+      </w:r>
+      <w:r>
+        <w:t xml:space="preserve">ettim. Bu ay iyi bir temel attığımı ve özellikle </w:t>
+      </w:r>
+      <w:proofErr w:type="spellStart"/>
+      <w:r>
+        <w:t>wsl</w:t>
+      </w:r>
+      <w:proofErr w:type="spellEnd"/>
+      <w:r>
+        <w:t xml:space="preserve"> kullanımı gibi farklı teknolojileri kullanmayı öğrendim ayrıca terminal işlemlerin</w:t>
+      </w:r>
+      <w:r>
+        <w:t>i</w:t>
+      </w:r>
+      <w:r>
+        <w:t xml:space="preserve"> her gün pratik yaparak daha iyi öğrendim</w:t>
+      </w:r>
+      <w:r>
+        <w:t>.</w:t>
+      </w:r>
+    </w:p>
+    <w:p/>
+    <w:p>
+      <w:r>
+        <w:t>Nerede Zorlandım</w:t>
+      </w:r>
+    </w:p>
+    <w:p>
+      <w:r>
+        <w:t xml:space="preserve">    </w:t>
+      </w:r>
+      <w:r>
+        <w:t>En çok zorlandığım konular git reset/</w:t>
+      </w:r>
+      <w:proofErr w:type="spellStart"/>
+      <w:r>
+        <w:t>revert</w:t>
+      </w:r>
+      <w:proofErr w:type="spellEnd"/>
+      <w:r>
+        <w:t xml:space="preserve"> farkı, </w:t>
+      </w:r>
+      <w:proofErr w:type="spellStart"/>
+      <w:r>
+        <w:t>WSL'deki</w:t>
+      </w:r>
+      <w:proofErr w:type="spellEnd"/>
+      <w:r>
+        <w:t xml:space="preserve"> Türkçe karakter </w:t>
+      </w:r>
+      <w:proofErr w:type="spellStart"/>
+      <w:r>
+        <w:t>encoding</w:t>
+      </w:r>
+      <w:proofErr w:type="spellEnd"/>
+      <w:r>
+        <w:t xml:space="preserve"> </w:t>
+      </w:r>
+      <w:proofErr w:type="gramStart"/>
+      <w:r>
+        <w:t>sorunları,</w:t>
+      </w:r>
+      <w:proofErr w:type="gramEnd"/>
+      <w:r>
+        <w:t xml:space="preserve"> ve </w:t>
+      </w:r>
+      <w:proofErr w:type="spellStart"/>
+      <w:r>
+        <w:t>LeetCode'da</w:t>
+      </w:r>
+      <w:proofErr w:type="spellEnd"/>
+      <w:r>
+        <w:t xml:space="preserve"> doğru veri yapısını seçme konusu</w:t>
+      </w:r>
+      <w:r>
+        <w:t xml:space="preserve"> ve </w:t>
+      </w:r>
+      <w:proofErr w:type="spellStart"/>
+      <w:r>
+        <w:t>syntax</w:t>
+      </w:r>
+      <w:proofErr w:type="spellEnd"/>
+      <w:r>
+        <w:t xml:space="preserve"> konusun da </w:t>
+      </w:r>
+      <w:proofErr w:type="spellStart"/>
+      <w:r>
+        <w:t>da</w:t>
+      </w:r>
+      <w:proofErr w:type="spellEnd"/>
+      <w:r>
+        <w:t xml:space="preserve"> yer yer kaynakları açıp bakma ihtiyacı duydum</w:t>
+      </w:r>
+      <w:r>
+        <w:t xml:space="preserve">. Ayrıca dosya yolu ve terminal komut sözdizimi hataları da </w:t>
+      </w:r>
+      <w:r>
+        <w:t>yer yer</w:t>
+      </w:r>
+      <w:r>
+        <w:t xml:space="preserve"> karşılaştığım zorluklardı.</w:t>
       </w:r>
     </w:p>
     <w:p/>
     <w:p/>
+    <w:p/>
+    <w:p>
+      <w:r>
+        <w:lastRenderedPageBreak/>
+        <w:t>Ay 2’de Nelere Dikkat Etmeliyim</w:t>
+      </w:r>
+    </w:p>
+    <w:p>
+      <w:r>
+        <w:t xml:space="preserve">    Uyku düzenimi daha tutarlı olmalıyım ayrıca gün içinde zaman yönetimine de dikkat </w:t>
+      </w:r>
+      <w:proofErr w:type="spellStart"/>
+      <w:proofErr w:type="gramStart"/>
+      <w:r>
+        <w:t>etmeliyim.LeetCode</w:t>
+      </w:r>
+      <w:proofErr w:type="spellEnd"/>
+      <w:proofErr w:type="gramEnd"/>
+      <w:r>
+        <w:t xml:space="preserve"> problemlerinde </w:t>
+      </w:r>
+      <w:r>
+        <w:t>zaman karmaşıklığına ve en optimum çözüme odaklanmalıyım.</w:t>
+      </w:r>
+    </w:p>
     <w:sectPr>
       <w:pgSz w:w="11906" w:h="16838"/>
       <w:pgMar w:top="1417" w:right="1417" w:bottom="1417" w:left="1417" w:header="708" w:footer="708" w:gutter="0"/>

</xml_diff>